<commit_message>
add project to do list, update contact email, and update footer text
</commit_message>
<xml_diff>
--- a/Rodel_Ramos_SoftwareAI_Developer.docx
+++ b/Rodel_Ramos_SoftwareAI_Developer.docx
@@ -17,19 +17,13 @@
           <w:left w:w="10" w:type="dxa"/>
           <w:right w:w="10" w:type="dxa"/>
         </w:tblCellMar>
-        <w:tblLook w:val="04A0" w:firstRow="1" w:lastRow="0" w:firstColumn="1" w:lastColumn="0" w:noHBand="0" w:noVBand="1"/>
+        <w:tblLook w:val="0000" w:firstRow="0" w:lastRow="0" w:firstColumn="0" w:lastColumn="0" w:noHBand="0" w:noVBand="0"/>
       </w:tblPr>
       <w:tblGrid>
         <w:gridCol w:w="6000"/>
         <w:gridCol w:w="4080"/>
       </w:tblGrid>
       <w:tr>
-        <w:tblPrEx>
-          <w:tblCellMar>
-            <w:top w:w="0" w:type="dxa"/>
-            <w:bottom w:w="0" w:type="dxa"/>
-          </w:tblCellMar>
-        </w:tblPrEx>
         <w:tc>
           <w:tcPr>
             <w:tcW w:w="6000" w:type="dxa"/>
@@ -74,7 +68,7 @@
                 <w:sz w:val="26"/>
                 <w:szCs w:val="26"/>
               </w:rPr>
-              <w:t>Software Developer</w:t>
+              <w:t>Software &amp; AI Developer</w:t>
             </w:r>
           </w:p>
         </w:tc>
@@ -108,34 +102,7 @@
                 <w:sz w:val="19"/>
                 <w:szCs w:val="19"/>
               </w:rPr>
-              <w:t>r</w:t>
-            </w:r>
-            <w:r>
-              <w:rPr>
-                <w:rFonts w:ascii="Arial" w:eastAsia="Arial" w:hAnsi="Arial" w:cs="Arial"/>
-                <w:color w:val="555555"/>
-                <w:sz w:val="19"/>
-                <w:szCs w:val="19"/>
-              </w:rPr>
-              <w:t>amosrodel</w:t>
-            </w:r>
-            <w:r>
-              <w:rPr>
-                <w:rFonts w:ascii="Arial" w:eastAsia="Arial" w:hAnsi="Arial" w:cs="Arial"/>
-                <w:color w:val="555555"/>
-                <w:sz w:val="19"/>
-                <w:szCs w:val="19"/>
-              </w:rPr>
-              <w:t>.dev31</w:t>
-            </w:r>
-            <w:r>
-              <w:rPr>
-                <w:rFonts w:ascii="Arial" w:eastAsia="Arial" w:hAnsi="Arial" w:cs="Arial"/>
-                <w:color w:val="555555"/>
-                <w:sz w:val="19"/>
-                <w:szCs w:val="19"/>
-              </w:rPr>
-              <w:t>@gmail.com</w:t>
+              <w:t>ramosrodel.dev31@gmail.com</w:t>
             </w:r>
           </w:p>
           <w:p>
@@ -173,15 +140,6 @@
               <w:spacing w:before="20"/>
               <w:jc w:val="right"/>
             </w:pPr>
-            <w:r>
-              <w:rPr>
-                <w:rFonts w:ascii="Arial" w:eastAsia="Arial" w:hAnsi="Arial" w:cs="Arial"/>
-                <w:color w:val="2E7D32"/>
-                <w:sz w:val="19"/>
-                <w:szCs w:val="19"/>
-              </w:rPr>
-              <w:t>Available: 9:00 AM – 5:00 PM CST</w:t>
-            </w:r>
           </w:p>
         </w:tc>
       </w:tr>
@@ -228,14 +186,35 @@
           <w:rFonts w:ascii="Arial" w:eastAsia="Arial" w:hAnsi="Arial" w:cs="Arial"/>
           <w:color w:val="555555"/>
         </w:rPr>
-        <w:t>Result-driven</w:t>
-      </w:r>
-      <w:r>
-        <w:rPr>
-          <w:rFonts w:ascii="Arial" w:eastAsia="Arial" w:hAnsi="Arial" w:cs="Arial"/>
-          <w:color w:val="555555"/>
-        </w:rPr>
-        <w:t xml:space="preserve"> Software Developer with hands-on expertise in C#, Python, PHP, JavaScript, Google Apps Script, and MySQL, and a growing focus on AI/ML-driven automation and data-integrated solutions. Proven ability to build custom applications—from grading and enrollment systems to profiler tools, web directories, and cloud-based Google Workspace automation—that streamline operations and improve decision-making. Experienced in translating complex business requirements into scalable, maintainable systems. Seeking to apply full-stack development, database engineering, workflow automation, and AI exploration skills to enhance manufacturing workflows and operational efficiency at Pearl Talent.</w:t>
+        <w:t>Result-driven Software &amp; AI Developer with hands-on expertise in C#, Python, PHP, JavaScript, Google Apps Script, and MySQL, and a growing focus on AI/ML-driven automation and data-integrated solutions. Proven ability to build custom applications</w:t>
+      </w:r>
+      <w:r>
+        <w:rPr>
+          <w:rFonts w:ascii="Arial" w:eastAsia="Arial" w:hAnsi="Arial" w:cs="Arial"/>
+          <w:color w:val="555555"/>
+        </w:rPr>
+        <w:t xml:space="preserve"> </w:t>
+      </w:r>
+      <w:r>
+        <w:rPr>
+          <w:rFonts w:ascii="Arial" w:eastAsia="Arial" w:hAnsi="Arial" w:cs="Arial"/>
+          <w:color w:val="555555"/>
+        </w:rPr>
+        <w:t>from grading and enrollment systems to profiler tools, web directories, and cloud-based Google Workspace automation</w:t>
+      </w:r>
+      <w:r>
+        <w:rPr>
+          <w:rFonts w:ascii="Arial" w:eastAsia="Arial" w:hAnsi="Arial" w:cs="Arial"/>
+          <w:color w:val="555555"/>
+        </w:rPr>
+        <w:t xml:space="preserve"> </w:t>
+      </w:r>
+      <w:r>
+        <w:rPr>
+          <w:rFonts w:ascii="Arial" w:eastAsia="Arial" w:hAnsi="Arial" w:cs="Arial"/>
+          <w:color w:val="555555"/>
+        </w:rPr>
+        <w:t>that streamline operations and improve decision-making. Experienced in translating complex business requirements into scalable, maintainable systems. Seeking to apply full-stack development, database engineering, workflow automation, and AI exploration skills to enhance manufacturing workflows and operational efficiency at Pearl Talent.</w:t>
       </w:r>
     </w:p>
     <w:p>
@@ -278,19 +257,13 @@
           <w:left w:w="10" w:type="dxa"/>
           <w:right w:w="10" w:type="dxa"/>
         </w:tblCellMar>
-        <w:tblLook w:val="04A0" w:firstRow="1" w:lastRow="0" w:firstColumn="1" w:lastColumn="0" w:noHBand="0" w:noVBand="1"/>
+        <w:tblLook w:val="0000" w:firstRow="0" w:lastRow="0" w:firstColumn="0" w:lastColumn="0" w:noHBand="0" w:noVBand="0"/>
       </w:tblPr>
       <w:tblGrid>
         <w:gridCol w:w="2200"/>
         <w:gridCol w:w="7880"/>
       </w:tblGrid>
       <w:tr>
-        <w:tblPrEx>
-          <w:tblCellMar>
-            <w:top w:w="0" w:type="dxa"/>
-            <w:bottom w:w="0" w:type="dxa"/>
-          </w:tblCellMar>
-        </w:tblPrEx>
         <w:tc>
           <w:tcPr>
             <w:tcW w:w="2200" w:type="dxa"/>
@@ -347,12 +320,6 @@
         </w:tc>
       </w:tr>
       <w:tr>
-        <w:tblPrEx>
-          <w:tblCellMar>
-            <w:top w:w="0" w:type="dxa"/>
-            <w:bottom w:w="0" w:type="dxa"/>
-          </w:tblCellMar>
-        </w:tblPrEx>
         <w:tc>
           <w:tcPr>
             <w:tcW w:w="2200" w:type="dxa"/>
@@ -409,12 +376,6 @@
         </w:tc>
       </w:tr>
       <w:tr>
-        <w:tblPrEx>
-          <w:tblCellMar>
-            <w:top w:w="0" w:type="dxa"/>
-            <w:bottom w:w="0" w:type="dxa"/>
-          </w:tblCellMar>
-        </w:tblPrEx>
         <w:tc>
           <w:tcPr>
             <w:tcW w:w="2200" w:type="dxa"/>
@@ -471,12 +432,6 @@
         </w:tc>
       </w:tr>
       <w:tr>
-        <w:tblPrEx>
-          <w:tblCellMar>
-            <w:top w:w="0" w:type="dxa"/>
-            <w:bottom w:w="0" w:type="dxa"/>
-          </w:tblCellMar>
-        </w:tblPrEx>
         <w:tc>
           <w:tcPr>
             <w:tcW w:w="2200" w:type="dxa"/>
@@ -533,12 +488,6 @@
         </w:tc>
       </w:tr>
       <w:tr>
-        <w:tblPrEx>
-          <w:tblCellMar>
-            <w:top w:w="0" w:type="dxa"/>
-            <w:bottom w:w="0" w:type="dxa"/>
-          </w:tblCellMar>
-        </w:tblPrEx>
         <w:tc>
           <w:tcPr>
             <w:tcW w:w="2200" w:type="dxa"/>
@@ -595,12 +544,6 @@
         </w:tc>
       </w:tr>
       <w:tr>
-        <w:tblPrEx>
-          <w:tblCellMar>
-            <w:top w:w="0" w:type="dxa"/>
-            <w:bottom w:w="0" w:type="dxa"/>
-          </w:tblCellMar>
-        </w:tblPrEx>
         <w:tc>
           <w:tcPr>
             <w:tcW w:w="2200" w:type="dxa"/>
@@ -657,12 +600,6 @@
         </w:tc>
       </w:tr>
       <w:tr>
-        <w:tblPrEx>
-          <w:tblCellMar>
-            <w:top w:w="0" w:type="dxa"/>
-            <w:bottom w:w="0" w:type="dxa"/>
-          </w:tblCellMar>
-        </w:tblPrEx>
         <w:tc>
           <w:tcPr>
             <w:tcW w:w="2200" w:type="dxa"/>
@@ -719,12 +656,6 @@
         </w:tc>
       </w:tr>
       <w:tr>
-        <w:tblPrEx>
-          <w:tblCellMar>
-            <w:top w:w="0" w:type="dxa"/>
-            <w:bottom w:w="0" w:type="dxa"/>
-          </w:tblCellMar>
-        </w:tblPrEx>
         <w:tc>
           <w:tcPr>
             <w:tcW w:w="2200" w:type="dxa"/>
@@ -803,479 +734,6 @@
           <w:sz w:val="22"/>
           <w:szCs w:val="22"/>
         </w:rPr>
-        <w:t>KEY PROJECTS</w:t>
-      </w:r>
-    </w:p>
-    <w:p>
-      <w:pPr>
-        <w:spacing w:before="140" w:after="40"/>
-      </w:pPr>
-      <w:r>
-        <w:rPr>
-          <w:rFonts w:ascii="Arial" w:eastAsia="Arial" w:hAnsi="Arial" w:cs="Arial"/>
-          <w:b/>
-          <w:bCs/>
-          <w:color w:val="1B3A6B"/>
-          <w:sz w:val="21"/>
-          <w:szCs w:val="21"/>
-        </w:rPr>
-        <w:t>Grading System</w:t>
-      </w:r>
-      <w:r>
-        <w:rPr>
-          <w:rFonts w:ascii="Arial" w:eastAsia="Arial" w:hAnsi="Arial" w:cs="Arial"/>
-          <w:color w:val="888888"/>
-          <w:sz w:val="19"/>
-          <w:szCs w:val="19"/>
-        </w:rPr>
-        <w:t xml:space="preserve">   ·   </w:t>
-      </w:r>
-      <w:r>
-        <w:rPr>
-          <w:rFonts w:ascii="Arial" w:eastAsia="Arial" w:hAnsi="Arial" w:cs="Arial"/>
-          <w:b/>
-          <w:bCs/>
-          <w:color w:val="2E7D32"/>
-          <w:sz w:val="19"/>
-          <w:szCs w:val="19"/>
-        </w:rPr>
-        <w:t>C# · MySQL</w:t>
-      </w:r>
-    </w:p>
-    <w:p>
-      <w:pPr>
-        <w:pStyle w:val="ListParagraph"/>
-        <w:numPr>
-          <w:ilvl w:val="0"/>
-          <w:numId w:val="2"/>
-        </w:numPr>
-        <w:spacing w:before="40" w:after="40"/>
-      </w:pPr>
-      <w:r>
-        <w:rPr>
-          <w:rFonts w:ascii="Arial" w:eastAsia="Arial" w:hAnsi="Arial" w:cs="Arial"/>
-          <w:color w:val="555555"/>
-        </w:rPr>
-        <w:t>Designed and built a full-featured academic grading system with automated grade computation, student record management, and report generation.</w:t>
-      </w:r>
-    </w:p>
-    <w:p>
-      <w:pPr>
-        <w:pStyle w:val="ListParagraph"/>
-        <w:numPr>
-          <w:ilvl w:val="0"/>
-          <w:numId w:val="2"/>
-        </w:numPr>
-        <w:spacing w:before="40" w:after="40"/>
-      </w:pPr>
-      <w:r>
-        <w:rPr>
-          <w:rFonts w:ascii="Arial" w:eastAsia="Arial" w:hAnsi="Arial" w:cs="Arial"/>
-          <w:color w:val="555555"/>
-        </w:rPr>
-        <w:t>Implemented relational database schema in MySQL supporting multi-subject, multi-section data with referential integrity.</w:t>
-      </w:r>
-    </w:p>
-    <w:p>
-      <w:pPr>
-        <w:pStyle w:val="ListParagraph"/>
-        <w:numPr>
-          <w:ilvl w:val="0"/>
-          <w:numId w:val="2"/>
-        </w:numPr>
-        <w:spacing w:before="40" w:after="40"/>
-      </w:pPr>
-      <w:r>
-        <w:rPr>
-          <w:rFonts w:ascii="Arial" w:eastAsia="Arial" w:hAnsi="Arial" w:cs="Arial"/>
-          <w:color w:val="555555"/>
-        </w:rPr>
-        <w:t>Delivered a Windows Forms UI enabling instructors to input, modify, and export grading data with minimal training required.</w:t>
-      </w:r>
-    </w:p>
-    <w:p>
-      <w:pPr>
-        <w:spacing w:before="140" w:after="40"/>
-      </w:pPr>
-      <w:r>
-        <w:rPr>
-          <w:rFonts w:ascii="Arial" w:eastAsia="Arial" w:hAnsi="Arial" w:cs="Arial"/>
-          <w:b/>
-          <w:bCs/>
-          <w:color w:val="1B3A6B"/>
-          <w:sz w:val="21"/>
-          <w:szCs w:val="21"/>
-        </w:rPr>
-        <w:t>Enrollment &amp; Billing System</w:t>
-      </w:r>
-      <w:r>
-        <w:rPr>
-          <w:rFonts w:ascii="Arial" w:eastAsia="Arial" w:hAnsi="Arial" w:cs="Arial"/>
-          <w:color w:val="888888"/>
-          <w:sz w:val="19"/>
-          <w:szCs w:val="19"/>
-        </w:rPr>
-        <w:t xml:space="preserve">   ·   </w:t>
-      </w:r>
-      <w:r>
-        <w:rPr>
-          <w:rFonts w:ascii="Arial" w:eastAsia="Arial" w:hAnsi="Arial" w:cs="Arial"/>
-          <w:b/>
-          <w:bCs/>
-          <w:color w:val="2E7D32"/>
-          <w:sz w:val="19"/>
-          <w:szCs w:val="19"/>
-        </w:rPr>
-        <w:t>C# · MySQL</w:t>
-      </w:r>
-    </w:p>
-    <w:p>
-      <w:pPr>
-        <w:pStyle w:val="ListParagraph"/>
-        <w:numPr>
-          <w:ilvl w:val="0"/>
-          <w:numId w:val="2"/>
-        </w:numPr>
-        <w:spacing w:before="40" w:after="40"/>
-      </w:pPr>
-      <w:r>
-        <w:rPr>
-          <w:rFonts w:ascii="Arial" w:eastAsia="Arial" w:hAnsi="Arial" w:cs="Arial"/>
-          <w:color w:val="555555"/>
-        </w:rPr>
-        <w:t>Developed an end-to-end enrollment and billing platform automating student registration, fee computation, and payment tracking workflows.</w:t>
-      </w:r>
-    </w:p>
-    <w:p>
-      <w:pPr>
-        <w:pStyle w:val="ListParagraph"/>
-        <w:numPr>
-          <w:ilvl w:val="0"/>
-          <w:numId w:val="2"/>
-        </w:numPr>
-        <w:spacing w:before="40" w:after="40"/>
-      </w:pPr>
-      <w:r>
-        <w:rPr>
-          <w:rFonts w:ascii="Arial" w:eastAsia="Arial" w:hAnsi="Arial" w:cs="Arial"/>
-          <w:color w:val="555555"/>
-        </w:rPr>
-        <w:t>Integrated dynamic billing rules to handle varying tuition structures, discounts, and installment scheduling—reducing manual processing time.</w:t>
-      </w:r>
-    </w:p>
-    <w:p>
-      <w:pPr>
-        <w:pStyle w:val="ListParagraph"/>
-        <w:numPr>
-          <w:ilvl w:val="0"/>
-          <w:numId w:val="2"/>
-        </w:numPr>
-        <w:spacing w:before="40" w:after="40"/>
-      </w:pPr>
-      <w:r>
-        <w:rPr>
-          <w:rFonts w:ascii="Arial" w:eastAsia="Arial" w:hAnsi="Arial" w:cs="Arial"/>
-          <w:color w:val="555555"/>
-        </w:rPr>
-        <w:t>Built comprehensive reporting dashboards to give administrators real-time visibility into enrollment status and financial data.</w:t>
-      </w:r>
-    </w:p>
-    <w:p>
-      <w:pPr>
-        <w:spacing w:before="140" w:after="40"/>
-      </w:pPr>
-      <w:r>
-        <w:rPr>
-          <w:rFonts w:ascii="Arial" w:eastAsia="Arial" w:hAnsi="Arial" w:cs="Arial"/>
-          <w:b/>
-          <w:bCs/>
-          <w:color w:val="1B3A6B"/>
-          <w:sz w:val="21"/>
-          <w:szCs w:val="21"/>
-        </w:rPr>
-        <w:t>School Directory</w:t>
-      </w:r>
-      <w:r>
-        <w:rPr>
-          <w:rFonts w:ascii="Arial" w:eastAsia="Arial" w:hAnsi="Arial" w:cs="Arial"/>
-          <w:color w:val="888888"/>
-          <w:sz w:val="19"/>
-          <w:szCs w:val="19"/>
-        </w:rPr>
-        <w:t xml:space="preserve">   ·   </w:t>
-      </w:r>
-      <w:r>
-        <w:rPr>
-          <w:rFonts w:ascii="Arial" w:eastAsia="Arial" w:hAnsi="Arial" w:cs="Arial"/>
-          <w:b/>
-          <w:bCs/>
-          <w:color w:val="2E7D32"/>
-          <w:sz w:val="19"/>
-          <w:szCs w:val="19"/>
-        </w:rPr>
-        <w:t>PHP · MySQL</w:t>
-      </w:r>
-    </w:p>
-    <w:p>
-      <w:pPr>
-        <w:pStyle w:val="ListParagraph"/>
-        <w:numPr>
-          <w:ilvl w:val="0"/>
-          <w:numId w:val="2"/>
-        </w:numPr>
-        <w:spacing w:before="40" w:after="40"/>
-      </w:pPr>
-      <w:r>
-        <w:rPr>
-          <w:rFonts w:ascii="Arial" w:eastAsia="Arial" w:hAnsi="Arial" w:cs="Arial"/>
-          <w:color w:val="555555"/>
-        </w:rPr>
-        <w:t>Created a web-based school directory application using PHP MVC architecture, enabling searchable staff and department records.</w:t>
-      </w:r>
-    </w:p>
-    <w:p>
-      <w:pPr>
-        <w:pStyle w:val="ListParagraph"/>
-        <w:numPr>
-          <w:ilvl w:val="0"/>
-          <w:numId w:val="2"/>
-        </w:numPr>
-        <w:spacing w:before="40" w:after="40"/>
-      </w:pPr>
-      <w:r>
-        <w:rPr>
-          <w:rFonts w:ascii="Arial" w:eastAsia="Arial" w:hAnsi="Arial" w:cs="Arial"/>
-          <w:color w:val="555555"/>
-        </w:rPr>
-        <w:t>Designed normalized MySQL database with optimized queries to support fast lookup across hundreds of records.</w:t>
-      </w:r>
-    </w:p>
-    <w:p>
-      <w:pPr>
-        <w:pStyle w:val="ListParagraph"/>
-        <w:numPr>
-          <w:ilvl w:val="0"/>
-          <w:numId w:val="2"/>
-        </w:numPr>
-        <w:spacing w:before="40" w:after="40"/>
-      </w:pPr>
-      <w:r>
-        <w:rPr>
-          <w:rFonts w:ascii="Arial" w:eastAsia="Arial" w:hAnsi="Arial" w:cs="Arial"/>
-          <w:color w:val="555555"/>
-        </w:rPr>
-        <w:t>Implemented role-based access control to differentiate admin and viewer permissions with secure session handling.</w:t>
-      </w:r>
-    </w:p>
-    <w:p>
-      <w:pPr>
-        <w:spacing w:before="140" w:after="40"/>
-      </w:pPr>
-      <w:r>
-        <w:rPr>
-          <w:rFonts w:ascii="Arial" w:eastAsia="Arial" w:hAnsi="Arial" w:cs="Arial"/>
-          <w:b/>
-          <w:bCs/>
-          <w:color w:val="1B3A6B"/>
-          <w:sz w:val="21"/>
-          <w:szCs w:val="21"/>
-        </w:rPr>
-        <w:lastRenderedPageBreak/>
-        <w:t>Profiler App</w:t>
-      </w:r>
-      <w:r>
-        <w:rPr>
-          <w:rFonts w:ascii="Arial" w:eastAsia="Arial" w:hAnsi="Arial" w:cs="Arial"/>
-          <w:color w:val="888888"/>
-          <w:sz w:val="19"/>
-          <w:szCs w:val="19"/>
-        </w:rPr>
-        <w:t xml:space="preserve">   ·   </w:t>
-      </w:r>
-      <w:r>
-        <w:rPr>
-          <w:rFonts w:ascii="Arial" w:eastAsia="Arial" w:hAnsi="Arial" w:cs="Arial"/>
-          <w:b/>
-          <w:bCs/>
-          <w:color w:val="2E7D32"/>
-          <w:sz w:val="19"/>
-          <w:szCs w:val="19"/>
-        </w:rPr>
-        <w:t>Python Django · MySQL</w:t>
-      </w:r>
-    </w:p>
-    <w:p>
-      <w:pPr>
-        <w:pStyle w:val="ListParagraph"/>
-        <w:numPr>
-          <w:ilvl w:val="0"/>
-          <w:numId w:val="2"/>
-        </w:numPr>
-        <w:spacing w:before="40" w:after="40"/>
-      </w:pPr>
-      <w:r>
-        <w:rPr>
-          <w:rFonts w:ascii="Arial" w:eastAsia="Arial" w:hAnsi="Arial" w:cs="Arial"/>
-          <w:color w:val="555555"/>
-        </w:rPr>
-        <w:t>Built a Django-powered profiler application for collecting, storing, and displaying structured user/entity profile data via a clean web interface.</w:t>
-      </w:r>
-    </w:p>
-    <w:p>
-      <w:pPr>
-        <w:pStyle w:val="ListParagraph"/>
-        <w:numPr>
-          <w:ilvl w:val="0"/>
-          <w:numId w:val="2"/>
-        </w:numPr>
-        <w:spacing w:before="40" w:after="40"/>
-      </w:pPr>
-      <w:r>
-        <w:rPr>
-          <w:rFonts w:ascii="Arial" w:eastAsia="Arial" w:hAnsi="Arial" w:cs="Arial"/>
-          <w:color w:val="555555"/>
-        </w:rPr>
-        <w:t>Leveraged Django ORM with MySQL backend to handle profile CRUD operations, search filtering, and data exports.</w:t>
-      </w:r>
-    </w:p>
-    <w:p>
-      <w:pPr>
-        <w:pStyle w:val="ListParagraph"/>
-        <w:numPr>
-          <w:ilvl w:val="0"/>
-          <w:numId w:val="2"/>
-        </w:numPr>
-        <w:spacing w:before="40" w:after="40"/>
-      </w:pPr>
-      <w:r>
-        <w:rPr>
-          <w:rFonts w:ascii="Arial" w:eastAsia="Arial" w:hAnsi="Arial" w:cs="Arial"/>
-          <w:color w:val="555555"/>
-        </w:rPr>
-        <w:t>Designed RESTful endpoints to allow external integrations and demonstrate API-first development practices.</w:t>
-      </w:r>
-    </w:p>
-    <w:p>
-      <w:pPr>
-        <w:spacing w:before="140" w:after="40"/>
-      </w:pPr>
-      <w:r>
-        <w:rPr>
-          <w:rFonts w:ascii="Arial" w:eastAsia="Arial" w:hAnsi="Arial" w:cs="Arial"/>
-          <w:b/>
-          <w:bCs/>
-          <w:color w:val="1B3A6B"/>
-          <w:sz w:val="21"/>
-          <w:szCs w:val="21"/>
-        </w:rPr>
-        <w:t>Enrollment &amp; Billing System (Google Workspace Edition)</w:t>
-      </w:r>
-      <w:r>
-        <w:rPr>
-          <w:rFonts w:ascii="Arial" w:eastAsia="Arial" w:hAnsi="Arial" w:cs="Arial"/>
-          <w:color w:val="888888"/>
-          <w:sz w:val="19"/>
-          <w:szCs w:val="19"/>
-        </w:rPr>
-        <w:t xml:space="preserve">   ·   </w:t>
-      </w:r>
-      <w:r>
-        <w:rPr>
-          <w:rFonts w:ascii="Arial" w:eastAsia="Arial" w:hAnsi="Arial" w:cs="Arial"/>
-          <w:b/>
-          <w:bCs/>
-          <w:color w:val="2E7D32"/>
-          <w:sz w:val="19"/>
-          <w:szCs w:val="19"/>
-        </w:rPr>
-        <w:t>Google Apps Script · Google Sheets · Google Forms · Google Drive</w:t>
-      </w:r>
-    </w:p>
-    <w:p>
-      <w:pPr>
-        <w:pStyle w:val="ListParagraph"/>
-        <w:numPr>
-          <w:ilvl w:val="0"/>
-          <w:numId w:val="2"/>
-        </w:numPr>
-        <w:spacing w:before="40" w:after="40"/>
-      </w:pPr>
-      <w:r>
-        <w:rPr>
-          <w:rFonts w:ascii="Arial" w:eastAsia="Arial" w:hAnsi="Arial" w:cs="Arial"/>
-          <w:color w:val="555555"/>
-        </w:rPr>
-        <w:t>Currently developing a cloud-based enrollment and billing system leveraging Google Apps Script to automate end-to-end student registration, fee generation, and payment tracking entirely within Google Workspace.</w:t>
-      </w:r>
-    </w:p>
-    <w:p>
-      <w:pPr>
-        <w:pStyle w:val="ListParagraph"/>
-        <w:numPr>
-          <w:ilvl w:val="0"/>
-          <w:numId w:val="2"/>
-        </w:numPr>
-        <w:spacing w:before="40" w:after="40"/>
-      </w:pPr>
-      <w:r>
-        <w:rPr>
-          <w:rFonts w:ascii="Arial" w:eastAsia="Arial" w:hAnsi="Arial" w:cs="Arial"/>
-          <w:color w:val="555555"/>
-        </w:rPr>
-        <w:t>Built custom scripts to process Google Form submissions, auto-populate enrollment records in Google Sheets, and trigger email notifications upon enrollment confirmation and billing updates.</w:t>
-      </w:r>
-    </w:p>
-    <w:p>
-      <w:pPr>
-        <w:pStyle w:val="ListParagraph"/>
-        <w:numPr>
-          <w:ilvl w:val="0"/>
-          <w:numId w:val="2"/>
-        </w:numPr>
-        <w:spacing w:before="40" w:after="40"/>
-      </w:pPr>
-      <w:r>
-        <w:rPr>
-          <w:rFonts w:ascii="Arial" w:eastAsia="Arial" w:hAnsi="Arial" w:cs="Arial"/>
-          <w:color w:val="555555"/>
-        </w:rPr>
-        <w:t>Designed automated billing workflows that compute tuition fees, apply discount rules, and generate printable billing statements—eliminating manual data entry and reducing processing errors.</w:t>
-      </w:r>
-    </w:p>
-    <w:p>
-      <w:pPr>
-        <w:pStyle w:val="ListParagraph"/>
-        <w:numPr>
-          <w:ilvl w:val="0"/>
-          <w:numId w:val="2"/>
-        </w:numPr>
-        <w:spacing w:before="40" w:after="40"/>
-      </w:pPr>
-      <w:r>
-        <w:rPr>
-          <w:rFonts w:ascii="Arial" w:eastAsia="Arial" w:hAnsi="Arial" w:cs="Arial"/>
-          <w:color w:val="555555"/>
-        </w:rPr>
-        <w:t>Integrated Google Drive for organized document storage (receipts, enrollment forms) with structured folder management via script automation.</w:t>
-      </w:r>
-    </w:p>
-    <w:p>
-      <w:pPr>
-        <w:pBdr>
-          <w:bottom w:val="single" w:sz="8" w:space="1" w:color="2E7D32"/>
-        </w:pBdr>
-        <w:spacing w:before="180" w:after="80"/>
-      </w:pPr>
-      <w:r>
-        <w:rPr>
-          <w:rFonts w:ascii="Arial" w:eastAsia="Arial" w:hAnsi="Arial" w:cs="Arial"/>
-          <w:b/>
-          <w:bCs/>
-          <w:color w:val="1B3A6B"/>
-          <w:spacing w:val="60"/>
-          <w:sz w:val="22"/>
-          <w:szCs w:val="22"/>
-        </w:rPr>
         <w:t>PROFESSIONAL EXPERIENCE</w:t>
       </w:r>
     </w:p>
@@ -1284,7 +742,7 @@
         <w:tabs>
           <w:tab w:val="right" w:pos="10080"/>
         </w:tabs>
-        <w:spacing w:before="160" w:after="40"/>
+        <w:spacing w:after="40"/>
       </w:pPr>
       <w:r>
         <w:rPr>
@@ -1295,14 +753,34 @@
           <w:sz w:val="22"/>
           <w:szCs w:val="22"/>
         </w:rPr>
-        <w:t>Competency Trainer / ICT Instructor</w:t>
+        <w:t xml:space="preserve">Competency Trainer / ICT </w:t>
+      </w:r>
+      <w:proofErr w:type="gramStart"/>
+      <w:r>
+        <w:rPr>
+          <w:rFonts w:ascii="Arial" w:eastAsia="Arial" w:hAnsi="Arial" w:cs="Arial"/>
+          <w:b/>
+          <w:bCs/>
+          <w:color w:val="1B3A6B"/>
+          <w:sz w:val="22"/>
+          <w:szCs w:val="22"/>
+        </w:rPr>
+        <w:t>Instructor</w:t>
       </w:r>
       <w:r>
         <w:rPr>
           <w:rFonts w:ascii="Arial" w:eastAsia="Arial" w:hAnsi="Arial" w:cs="Arial"/>
           <w:color w:val="888888"/>
         </w:rPr>
-        <w:t xml:space="preserve">  |  </w:t>
+        <w:t xml:space="preserve">  |</w:t>
+      </w:r>
+      <w:proofErr w:type="gramEnd"/>
+      <w:r>
+        <w:rPr>
+          <w:rFonts w:ascii="Arial" w:eastAsia="Arial" w:hAnsi="Arial" w:cs="Arial"/>
+          <w:color w:val="888888"/>
+        </w:rPr>
+        <w:t xml:space="preserve">  </w:t>
       </w:r>
       <w:r>
         <w:rPr>
@@ -1316,6 +794,14 @@
       <w:r>
         <w:tab/>
       </w:r>
+    </w:p>
+    <w:p>
+      <w:pPr>
+        <w:tabs>
+          <w:tab w:val="right" w:pos="10080"/>
+        </w:tabs>
+        <w:spacing w:after="40"/>
+      </w:pPr>
       <w:r>
         <w:rPr>
           <w:rFonts w:ascii="Arial" w:eastAsia="Arial" w:hAnsi="Arial" w:cs="Arial"/>
@@ -1412,14 +898,34 @@
           <w:sz w:val="22"/>
           <w:szCs w:val="22"/>
         </w:rPr>
-        <w:t>ICT Instructor</w:t>
+        <w:t xml:space="preserve">ICT </w:t>
+      </w:r>
+      <w:proofErr w:type="gramStart"/>
+      <w:r>
+        <w:rPr>
+          <w:rFonts w:ascii="Arial" w:eastAsia="Arial" w:hAnsi="Arial" w:cs="Arial"/>
+          <w:b/>
+          <w:bCs/>
+          <w:color w:val="1B3A6B"/>
+          <w:sz w:val="22"/>
+          <w:szCs w:val="22"/>
+        </w:rPr>
+        <w:t>Instructor</w:t>
       </w:r>
       <w:r>
         <w:rPr>
           <w:rFonts w:ascii="Arial" w:eastAsia="Arial" w:hAnsi="Arial" w:cs="Arial"/>
           <w:color w:val="888888"/>
         </w:rPr>
-        <w:t xml:space="preserve">  |  </w:t>
+        <w:t xml:space="preserve">  |</w:t>
+      </w:r>
+      <w:proofErr w:type="gramEnd"/>
+      <w:r>
+        <w:rPr>
+          <w:rFonts w:ascii="Arial" w:eastAsia="Arial" w:hAnsi="Arial" w:cs="Arial"/>
+          <w:color w:val="888888"/>
+        </w:rPr>
+        <w:t xml:space="preserve">  </w:t>
       </w:r>
       <w:r>
         <w:rPr>
@@ -1502,8 +1008,6 @@
           <w:tab w:val="right" w:pos="10080"/>
         </w:tabs>
         <w:spacing w:before="160" w:after="40"/>
-      </w:pPr>
-      <w:r>
         <w:rPr>
           <w:rFonts w:ascii="Arial" w:eastAsia="Arial" w:hAnsi="Arial" w:cs="Arial"/>
           <w:b/>
@@ -1512,14 +1016,69 @@
           <w:sz w:val="22"/>
           <w:szCs w:val="22"/>
         </w:rPr>
-        <w:t>Trainer Assistant</w:t>
+      </w:pPr>
+    </w:p>
+    <w:p>
+      <w:pPr>
+        <w:tabs>
+          <w:tab w:val="right" w:pos="10080"/>
+        </w:tabs>
+        <w:spacing w:before="160" w:after="40"/>
+        <w:rPr>
+          <w:rFonts w:ascii="Arial" w:eastAsia="Arial" w:hAnsi="Arial" w:cs="Arial"/>
+          <w:b/>
+          <w:bCs/>
+          <w:color w:val="1B3A6B"/>
+          <w:sz w:val="22"/>
+          <w:szCs w:val="22"/>
+        </w:rPr>
+      </w:pPr>
+    </w:p>
+    <w:p>
+      <w:pPr>
+        <w:tabs>
+          <w:tab w:val="right" w:pos="10080"/>
+        </w:tabs>
+        <w:spacing w:before="160" w:after="40"/>
+      </w:pPr>
+      <w:r>
+        <w:rPr>
+          <w:rFonts w:ascii="Arial" w:eastAsia="Arial" w:hAnsi="Arial" w:cs="Arial"/>
+          <w:b/>
+          <w:bCs/>
+          <w:color w:val="1B3A6B"/>
+          <w:sz w:val="22"/>
+          <w:szCs w:val="22"/>
+        </w:rPr>
+        <w:lastRenderedPageBreak/>
+        <w:t xml:space="preserve">Trainer </w:t>
+      </w:r>
+      <w:proofErr w:type="gramStart"/>
+      <w:r>
+        <w:rPr>
+          <w:rFonts w:ascii="Arial" w:eastAsia="Arial" w:hAnsi="Arial" w:cs="Arial"/>
+          <w:b/>
+          <w:bCs/>
+          <w:color w:val="1B3A6B"/>
+          <w:sz w:val="22"/>
+          <w:szCs w:val="22"/>
+        </w:rPr>
+        <w:t>Assistant</w:t>
       </w:r>
       <w:r>
         <w:rPr>
           <w:rFonts w:ascii="Arial" w:eastAsia="Arial" w:hAnsi="Arial" w:cs="Arial"/>
           <w:color w:val="888888"/>
         </w:rPr>
-        <w:t xml:space="preserve">  |  </w:t>
+        <w:t xml:space="preserve">  |</w:t>
+      </w:r>
+      <w:proofErr w:type="gramEnd"/>
+      <w:r>
+        <w:rPr>
+          <w:rFonts w:ascii="Arial" w:eastAsia="Arial" w:hAnsi="Arial" w:cs="Arial"/>
+          <w:color w:val="888888"/>
+        </w:rPr>
+        <w:t xml:space="preserve">  </w:t>
       </w:r>
       <w:r>
         <w:rPr>
@@ -1581,6 +1140,13 @@
     </w:p>
     <w:p>
       <w:pPr>
+        <w:pStyle w:val="ListParagraph"/>
+        <w:spacing w:before="40" w:after="40"/>
+        <w:ind w:left="480"/>
+      </w:pPr>
+    </w:p>
+    <w:p>
+      <w:pPr>
         <w:pBdr>
           <w:bottom w:val="single" w:sz="8" w:space="1" w:color="2E7D32"/>
         </w:pBdr>
@@ -1596,6 +1162,660 @@
           <w:sz w:val="22"/>
           <w:szCs w:val="22"/>
         </w:rPr>
+        <w:t>KEY PROJECTS</w:t>
+      </w:r>
+    </w:p>
+    <w:p>
+      <w:pPr>
+        <w:spacing w:before="140" w:after="40"/>
+      </w:pPr>
+      <w:r>
+        <w:rPr>
+          <w:rFonts w:ascii="Arial" w:eastAsia="Arial" w:hAnsi="Arial" w:cs="Arial"/>
+          <w:b/>
+          <w:bCs/>
+          <w:color w:val="1B3A6B"/>
+          <w:sz w:val="21"/>
+          <w:szCs w:val="21"/>
+        </w:rPr>
+        <w:t>Grading System</w:t>
+      </w:r>
+      <w:r>
+        <w:rPr>
+          <w:rFonts w:ascii="Arial" w:eastAsia="Arial" w:hAnsi="Arial" w:cs="Arial"/>
+          <w:color w:val="888888"/>
+          <w:sz w:val="19"/>
+          <w:szCs w:val="19"/>
+        </w:rPr>
+        <w:t xml:space="preserve">   ·   </w:t>
+      </w:r>
+      <w:r>
+        <w:rPr>
+          <w:rFonts w:ascii="Arial" w:eastAsia="Arial" w:hAnsi="Arial" w:cs="Arial"/>
+          <w:b/>
+          <w:bCs/>
+          <w:color w:val="2E7D32"/>
+          <w:sz w:val="19"/>
+          <w:szCs w:val="19"/>
+        </w:rPr>
+        <w:t>C# · MySQL</w:t>
+      </w:r>
+    </w:p>
+    <w:p>
+      <w:pPr>
+        <w:pStyle w:val="ListParagraph"/>
+        <w:numPr>
+          <w:ilvl w:val="0"/>
+          <w:numId w:val="2"/>
+        </w:numPr>
+        <w:spacing w:before="40" w:after="40"/>
+      </w:pPr>
+      <w:r>
+        <w:rPr>
+          <w:rFonts w:ascii="Arial" w:eastAsia="Arial" w:hAnsi="Arial" w:cs="Arial"/>
+          <w:color w:val="555555"/>
+        </w:rPr>
+        <w:t>Designed and built a full-featured academic grading system with automated grade computation, student record management, and report generation.</w:t>
+      </w:r>
+    </w:p>
+    <w:p>
+      <w:pPr>
+        <w:pStyle w:val="ListParagraph"/>
+        <w:numPr>
+          <w:ilvl w:val="0"/>
+          <w:numId w:val="2"/>
+        </w:numPr>
+        <w:spacing w:before="40" w:after="40"/>
+      </w:pPr>
+      <w:r>
+        <w:rPr>
+          <w:rFonts w:ascii="Arial" w:eastAsia="Arial" w:hAnsi="Arial" w:cs="Arial"/>
+          <w:color w:val="555555"/>
+        </w:rPr>
+        <w:t>Implemented relational database schema in MySQL supporting multi-subject, multi-section data with referential integrity.</w:t>
+      </w:r>
+    </w:p>
+    <w:p>
+      <w:pPr>
+        <w:pStyle w:val="ListParagraph"/>
+        <w:numPr>
+          <w:ilvl w:val="0"/>
+          <w:numId w:val="2"/>
+        </w:numPr>
+        <w:spacing w:before="40" w:after="40"/>
+      </w:pPr>
+      <w:r>
+        <w:rPr>
+          <w:rFonts w:ascii="Arial" w:eastAsia="Arial" w:hAnsi="Arial" w:cs="Arial"/>
+          <w:color w:val="555555"/>
+        </w:rPr>
+        <w:t>Delivered a Windows Forms UI enabling instructors to input, modify, and export grading data with minimal training required.</w:t>
+      </w:r>
+    </w:p>
+    <w:p>
+      <w:pPr>
+        <w:spacing w:before="140" w:after="40"/>
+      </w:pPr>
+      <w:r>
+        <w:rPr>
+          <w:rFonts w:ascii="Arial" w:eastAsia="Arial" w:hAnsi="Arial" w:cs="Arial"/>
+          <w:b/>
+          <w:bCs/>
+          <w:color w:val="1B3A6B"/>
+          <w:sz w:val="21"/>
+          <w:szCs w:val="21"/>
+        </w:rPr>
+        <w:t>Enrollment &amp; Billing System</w:t>
+      </w:r>
+      <w:r>
+        <w:rPr>
+          <w:rFonts w:ascii="Arial" w:eastAsia="Arial" w:hAnsi="Arial" w:cs="Arial"/>
+          <w:color w:val="888888"/>
+          <w:sz w:val="19"/>
+          <w:szCs w:val="19"/>
+        </w:rPr>
+        <w:t xml:space="preserve">   ·   </w:t>
+      </w:r>
+      <w:r>
+        <w:rPr>
+          <w:rFonts w:ascii="Arial" w:eastAsia="Arial" w:hAnsi="Arial" w:cs="Arial"/>
+          <w:b/>
+          <w:bCs/>
+          <w:color w:val="2E7D32"/>
+          <w:sz w:val="19"/>
+          <w:szCs w:val="19"/>
+        </w:rPr>
+        <w:t>C# · MySQL</w:t>
+      </w:r>
+    </w:p>
+    <w:p>
+      <w:pPr>
+        <w:pStyle w:val="ListParagraph"/>
+        <w:numPr>
+          <w:ilvl w:val="0"/>
+          <w:numId w:val="2"/>
+        </w:numPr>
+        <w:spacing w:before="40" w:after="40"/>
+      </w:pPr>
+      <w:r>
+        <w:rPr>
+          <w:rFonts w:ascii="Arial" w:eastAsia="Arial" w:hAnsi="Arial" w:cs="Arial"/>
+          <w:color w:val="555555"/>
+        </w:rPr>
+        <w:t>Developed an end-to-end enrollment and billing platform automating student registration, fee computation, and payment tracking workflows.</w:t>
+      </w:r>
+    </w:p>
+    <w:p>
+      <w:pPr>
+        <w:pStyle w:val="ListParagraph"/>
+        <w:numPr>
+          <w:ilvl w:val="0"/>
+          <w:numId w:val="2"/>
+        </w:numPr>
+        <w:spacing w:before="40" w:after="40"/>
+      </w:pPr>
+      <w:r>
+        <w:rPr>
+          <w:rFonts w:ascii="Arial" w:eastAsia="Arial" w:hAnsi="Arial" w:cs="Arial"/>
+          <w:color w:val="555555"/>
+        </w:rPr>
+        <w:t>Integrated dynamic billing rules to handle varying tuition structures, discounts, and installment scheduling—reducing manual processing time.</w:t>
+      </w:r>
+    </w:p>
+    <w:p>
+      <w:pPr>
+        <w:pStyle w:val="ListParagraph"/>
+        <w:numPr>
+          <w:ilvl w:val="0"/>
+          <w:numId w:val="2"/>
+        </w:numPr>
+        <w:spacing w:before="40" w:after="40"/>
+      </w:pPr>
+      <w:r>
+        <w:rPr>
+          <w:rFonts w:ascii="Arial" w:eastAsia="Arial" w:hAnsi="Arial" w:cs="Arial"/>
+          <w:color w:val="555555"/>
+        </w:rPr>
+        <w:t>Built comprehensive reporting dashboards to give administrators real-time visibility into enrollment status and financial data.</w:t>
+      </w:r>
+    </w:p>
+    <w:p>
+      <w:pPr>
+        <w:spacing w:before="140" w:after="40"/>
+      </w:pPr>
+      <w:r>
+        <w:rPr>
+          <w:rFonts w:ascii="Arial" w:eastAsia="Arial" w:hAnsi="Arial" w:cs="Arial"/>
+          <w:b/>
+          <w:bCs/>
+          <w:color w:val="1B3A6B"/>
+          <w:sz w:val="21"/>
+          <w:szCs w:val="21"/>
+        </w:rPr>
+        <w:t>School Directory</w:t>
+      </w:r>
+      <w:r>
+        <w:rPr>
+          <w:rFonts w:ascii="Arial" w:eastAsia="Arial" w:hAnsi="Arial" w:cs="Arial"/>
+          <w:color w:val="888888"/>
+          <w:sz w:val="19"/>
+          <w:szCs w:val="19"/>
+        </w:rPr>
+        <w:t xml:space="preserve">   ·   </w:t>
+      </w:r>
+      <w:r>
+        <w:rPr>
+          <w:rFonts w:ascii="Arial" w:eastAsia="Arial" w:hAnsi="Arial" w:cs="Arial"/>
+          <w:b/>
+          <w:bCs/>
+          <w:color w:val="2E7D32"/>
+          <w:sz w:val="19"/>
+          <w:szCs w:val="19"/>
+        </w:rPr>
+        <w:t>PHP · MySQL</w:t>
+      </w:r>
+    </w:p>
+    <w:p>
+      <w:pPr>
+        <w:pStyle w:val="ListParagraph"/>
+        <w:numPr>
+          <w:ilvl w:val="0"/>
+          <w:numId w:val="2"/>
+        </w:numPr>
+        <w:spacing w:before="40" w:after="40"/>
+      </w:pPr>
+      <w:r>
+        <w:rPr>
+          <w:rFonts w:ascii="Arial" w:eastAsia="Arial" w:hAnsi="Arial" w:cs="Arial"/>
+          <w:color w:val="555555"/>
+        </w:rPr>
+        <w:t>Created a web-based school directory application using PHP MVC architecture, enabling searchable staff and department records.</w:t>
+      </w:r>
+    </w:p>
+    <w:p>
+      <w:pPr>
+        <w:pStyle w:val="ListParagraph"/>
+        <w:numPr>
+          <w:ilvl w:val="0"/>
+          <w:numId w:val="2"/>
+        </w:numPr>
+        <w:spacing w:before="40" w:after="40"/>
+      </w:pPr>
+      <w:r>
+        <w:rPr>
+          <w:rFonts w:ascii="Arial" w:eastAsia="Arial" w:hAnsi="Arial" w:cs="Arial"/>
+          <w:color w:val="555555"/>
+        </w:rPr>
+        <w:t>Designed normalized MySQL database with optimized queries to support fast lookup across hundreds of records.</w:t>
+      </w:r>
+    </w:p>
+    <w:p>
+      <w:pPr>
+        <w:pStyle w:val="ListParagraph"/>
+        <w:numPr>
+          <w:ilvl w:val="0"/>
+          <w:numId w:val="2"/>
+        </w:numPr>
+        <w:spacing w:before="40" w:after="40"/>
+      </w:pPr>
+      <w:r>
+        <w:rPr>
+          <w:rFonts w:ascii="Arial" w:eastAsia="Arial" w:hAnsi="Arial" w:cs="Arial"/>
+          <w:color w:val="555555"/>
+        </w:rPr>
+        <w:t>Implemented role-based access control to differentiate admin and viewer permissions with secure session handling.</w:t>
+      </w:r>
+    </w:p>
+    <w:p>
+      <w:pPr>
+        <w:spacing w:before="140" w:after="40"/>
+      </w:pPr>
+      <w:r>
+        <w:rPr>
+          <w:rFonts w:ascii="Arial" w:eastAsia="Arial" w:hAnsi="Arial" w:cs="Arial"/>
+          <w:b/>
+          <w:bCs/>
+          <w:color w:val="1B3A6B"/>
+          <w:sz w:val="21"/>
+          <w:szCs w:val="21"/>
+        </w:rPr>
+        <w:t>Profiler App</w:t>
+      </w:r>
+      <w:r>
+        <w:rPr>
+          <w:rFonts w:ascii="Arial" w:eastAsia="Arial" w:hAnsi="Arial" w:cs="Arial"/>
+          <w:color w:val="888888"/>
+          <w:sz w:val="19"/>
+          <w:szCs w:val="19"/>
+        </w:rPr>
+        <w:t xml:space="preserve">   ·   </w:t>
+      </w:r>
+      <w:r>
+        <w:rPr>
+          <w:rFonts w:ascii="Arial" w:eastAsia="Arial" w:hAnsi="Arial" w:cs="Arial"/>
+          <w:b/>
+          <w:bCs/>
+          <w:color w:val="2E7D32"/>
+          <w:sz w:val="19"/>
+          <w:szCs w:val="19"/>
+        </w:rPr>
+        <w:t>C# · MySQL</w:t>
+      </w:r>
+    </w:p>
+    <w:p>
+      <w:pPr>
+        <w:pStyle w:val="ListParagraph"/>
+        <w:numPr>
+          <w:ilvl w:val="0"/>
+          <w:numId w:val="2"/>
+        </w:numPr>
+        <w:spacing w:before="40" w:after="40"/>
+      </w:pPr>
+      <w:r>
+        <w:rPr>
+          <w:rFonts w:ascii="Arial" w:eastAsia="Arial" w:hAnsi="Arial" w:cs="Arial"/>
+          <w:color w:val="555555"/>
+        </w:rPr>
+        <w:t>Developed a Windows-based profiler application in C# for creating, managing, and displaying structured user and entity profile records with an intuitive UI.</w:t>
+      </w:r>
+    </w:p>
+    <w:p>
+      <w:pPr>
+        <w:pStyle w:val="ListParagraph"/>
+        <w:numPr>
+          <w:ilvl w:val="0"/>
+          <w:numId w:val="2"/>
+        </w:numPr>
+        <w:spacing w:before="40" w:after="40"/>
+      </w:pPr>
+      <w:r>
+        <w:rPr>
+          <w:rFonts w:ascii="Arial" w:eastAsia="Arial" w:hAnsi="Arial" w:cs="Arial"/>
+          <w:color w:val="555555"/>
+        </w:rPr>
+        <w:t>Designed and implemented a normalized MySQL database schema to handle profile data storage, retrieval, and search operations efficiently.</w:t>
+      </w:r>
+    </w:p>
+    <w:p>
+      <w:pPr>
+        <w:pStyle w:val="ListParagraph"/>
+        <w:numPr>
+          <w:ilvl w:val="0"/>
+          <w:numId w:val="2"/>
+        </w:numPr>
+        <w:spacing w:before="40" w:after="40"/>
+      </w:pPr>
+      <w:r>
+        <w:rPr>
+          <w:rFonts w:ascii="Arial" w:eastAsia="Arial" w:hAnsi="Arial" w:cs="Arial"/>
+          <w:color w:val="555555"/>
+        </w:rPr>
+        <w:t>Built CRUD functionality with data validation, enabling administrators to add, update, and archive profile entries with full audit trail support.</w:t>
+      </w:r>
+    </w:p>
+    <w:p>
+      <w:pPr>
+        <w:spacing w:before="140" w:after="40"/>
+      </w:pPr>
+      <w:r>
+        <w:rPr>
+          <w:rFonts w:ascii="Arial" w:eastAsia="Arial" w:hAnsi="Arial" w:cs="Arial"/>
+          <w:b/>
+          <w:bCs/>
+          <w:color w:val="1B3A6B"/>
+          <w:sz w:val="21"/>
+          <w:szCs w:val="21"/>
+        </w:rPr>
+        <w:t>To Do List App</w:t>
+      </w:r>
+      <w:r>
+        <w:rPr>
+          <w:rFonts w:ascii="Arial" w:eastAsia="Arial" w:hAnsi="Arial" w:cs="Arial"/>
+          <w:color w:val="888888"/>
+          <w:sz w:val="19"/>
+          <w:szCs w:val="19"/>
+        </w:rPr>
+        <w:t xml:space="preserve">   ·   </w:t>
+      </w:r>
+      <w:r>
+        <w:rPr>
+          <w:rFonts w:ascii="Arial" w:eastAsia="Arial" w:hAnsi="Arial" w:cs="Arial"/>
+          <w:b/>
+          <w:bCs/>
+          <w:color w:val="2E7D32"/>
+          <w:sz w:val="19"/>
+          <w:szCs w:val="19"/>
+        </w:rPr>
+        <w:t>Python Django · MySQL</w:t>
+      </w:r>
+    </w:p>
+    <w:p>
+      <w:pPr>
+        <w:pStyle w:val="ListParagraph"/>
+        <w:numPr>
+          <w:ilvl w:val="0"/>
+          <w:numId w:val="2"/>
+        </w:numPr>
+        <w:spacing w:before="40" w:after="40"/>
+      </w:pPr>
+      <w:r>
+        <w:rPr>
+          <w:rFonts w:ascii="Arial" w:eastAsia="Arial" w:hAnsi="Arial" w:cs="Arial"/>
+          <w:color w:val="555555"/>
+        </w:rPr>
+        <w:t>Built a full-featured task management web application using Python Django, enabling users to create, organize, update, and delete tasks through a clean and responsive interface.</w:t>
+      </w:r>
+    </w:p>
+    <w:p>
+      <w:pPr>
+        <w:pStyle w:val="ListParagraph"/>
+        <w:numPr>
+          <w:ilvl w:val="0"/>
+          <w:numId w:val="2"/>
+        </w:numPr>
+        <w:spacing w:before="40" w:after="40"/>
+      </w:pPr>
+      <w:r>
+        <w:rPr>
+          <w:rFonts w:ascii="Arial" w:eastAsia="Arial" w:hAnsi="Arial" w:cs="Arial"/>
+          <w:color w:val="555555"/>
+        </w:rPr>
+        <w:t>Implemented Django ORM with MySQL backend to persist task data, supporting task categorization, priority levels, due dates, and completion status tracking.</w:t>
+      </w:r>
+    </w:p>
+    <w:p>
+      <w:pPr>
+        <w:pStyle w:val="ListParagraph"/>
+        <w:numPr>
+          <w:ilvl w:val="0"/>
+          <w:numId w:val="2"/>
+        </w:numPr>
+        <w:spacing w:before="40" w:after="40"/>
+      </w:pPr>
+      <w:r>
+        <w:rPr>
+          <w:rFonts w:ascii="Arial" w:eastAsia="Arial" w:hAnsi="Arial" w:cs="Arial"/>
+          <w:color w:val="555555"/>
+        </w:rPr>
+        <w:t>Designed user authentication and session management so each user maintains their own private task list with secure login and logout functionality.</w:t>
+      </w:r>
+    </w:p>
+    <w:p>
+      <w:pPr>
+        <w:spacing w:before="140" w:after="40"/>
+        <w:rPr>
+          <w:rFonts w:ascii="Arial" w:eastAsia="Arial" w:hAnsi="Arial" w:cs="Arial"/>
+          <w:b/>
+          <w:bCs/>
+          <w:color w:val="1B3A6B"/>
+          <w:sz w:val="21"/>
+          <w:szCs w:val="21"/>
+        </w:rPr>
+      </w:pPr>
+    </w:p>
+    <w:p>
+      <w:pPr>
+        <w:spacing w:before="140" w:after="40"/>
+        <w:rPr>
+          <w:rFonts w:ascii="Arial" w:eastAsia="Arial" w:hAnsi="Arial" w:cs="Arial"/>
+          <w:b/>
+          <w:bCs/>
+          <w:color w:val="1B3A6B"/>
+          <w:sz w:val="21"/>
+          <w:szCs w:val="21"/>
+        </w:rPr>
+      </w:pPr>
+    </w:p>
+    <w:p>
+      <w:pPr>
+        <w:spacing w:before="140" w:after="40"/>
+        <w:rPr>
+          <w:rFonts w:ascii="Arial" w:eastAsia="Arial" w:hAnsi="Arial" w:cs="Arial"/>
+          <w:b/>
+          <w:bCs/>
+          <w:color w:val="1B3A6B"/>
+          <w:sz w:val="21"/>
+          <w:szCs w:val="21"/>
+        </w:rPr>
+      </w:pPr>
+    </w:p>
+    <w:p>
+      <w:pPr>
+        <w:spacing w:before="140" w:after="40"/>
+        <w:rPr>
+          <w:rFonts w:ascii="Arial" w:eastAsia="Arial" w:hAnsi="Arial" w:cs="Arial"/>
+          <w:b/>
+          <w:bCs/>
+          <w:color w:val="1B3A6B"/>
+          <w:sz w:val="21"/>
+          <w:szCs w:val="21"/>
+        </w:rPr>
+      </w:pPr>
+    </w:p>
+    <w:p>
+      <w:pPr>
+        <w:spacing w:before="140" w:after="40"/>
+        <w:rPr>
+          <w:rFonts w:ascii="Arial" w:eastAsia="Arial" w:hAnsi="Arial" w:cs="Arial"/>
+          <w:b/>
+          <w:bCs/>
+          <w:color w:val="1B3A6B"/>
+          <w:sz w:val="21"/>
+          <w:szCs w:val="21"/>
+        </w:rPr>
+      </w:pPr>
+    </w:p>
+    <w:p>
+      <w:pPr>
+        <w:spacing w:before="140" w:after="40"/>
+      </w:pPr>
+      <w:r>
+        <w:rPr>
+          <w:rFonts w:ascii="Arial" w:eastAsia="Arial" w:hAnsi="Arial" w:cs="Arial"/>
+          <w:b/>
+          <w:bCs/>
+          <w:color w:val="1B3A6B"/>
+          <w:sz w:val="21"/>
+          <w:szCs w:val="21"/>
+        </w:rPr>
+        <w:lastRenderedPageBreak/>
+        <w:t xml:space="preserve">Enrollment &amp; Billing System (Google Workspace </w:t>
+      </w:r>
+      <w:proofErr w:type="gramStart"/>
+      <w:r>
+        <w:rPr>
+          <w:rFonts w:ascii="Arial" w:eastAsia="Arial" w:hAnsi="Arial" w:cs="Arial"/>
+          <w:b/>
+          <w:bCs/>
+          <w:color w:val="1B3A6B"/>
+          <w:sz w:val="21"/>
+          <w:szCs w:val="21"/>
+        </w:rPr>
+        <w:t>Edition)</w:t>
+      </w:r>
+      <w:r>
+        <w:rPr>
+          <w:rFonts w:ascii="Arial" w:eastAsia="Arial" w:hAnsi="Arial" w:cs="Arial"/>
+          <w:color w:val="888888"/>
+          <w:sz w:val="19"/>
+          <w:szCs w:val="19"/>
+        </w:rPr>
+        <w:t xml:space="preserve">   </w:t>
+      </w:r>
+      <w:proofErr w:type="gramEnd"/>
+      <w:r>
+        <w:rPr>
+          <w:rFonts w:ascii="Arial" w:eastAsia="Arial" w:hAnsi="Arial" w:cs="Arial"/>
+          <w:color w:val="888888"/>
+          <w:sz w:val="19"/>
+          <w:szCs w:val="19"/>
+        </w:rPr>
+        <w:t xml:space="preserve">·   </w:t>
+      </w:r>
+      <w:r>
+        <w:rPr>
+          <w:rFonts w:ascii="Arial" w:eastAsia="Arial" w:hAnsi="Arial" w:cs="Arial"/>
+          <w:b/>
+          <w:bCs/>
+          <w:color w:val="2E7D32"/>
+          <w:sz w:val="19"/>
+          <w:szCs w:val="19"/>
+        </w:rPr>
+        <w:t>Google Apps Script · Google Sheets · Google Forms · Google Drive</w:t>
+      </w:r>
+    </w:p>
+    <w:p>
+      <w:pPr>
+        <w:pStyle w:val="ListParagraph"/>
+        <w:numPr>
+          <w:ilvl w:val="0"/>
+          <w:numId w:val="2"/>
+        </w:numPr>
+        <w:spacing w:before="40" w:after="40"/>
+      </w:pPr>
+      <w:r>
+        <w:rPr>
+          <w:rFonts w:ascii="Arial" w:eastAsia="Arial" w:hAnsi="Arial" w:cs="Arial"/>
+          <w:color w:val="555555"/>
+        </w:rPr>
+        <w:t>Currently developing a cloud-based enrollment and billing system leveraging Google Apps Script to automate end-to-end student registration, fee generation, and payment tracking entirely within Google Workspace.</w:t>
+      </w:r>
+    </w:p>
+    <w:p>
+      <w:pPr>
+        <w:pStyle w:val="ListParagraph"/>
+        <w:numPr>
+          <w:ilvl w:val="0"/>
+          <w:numId w:val="2"/>
+        </w:numPr>
+        <w:spacing w:before="40" w:after="40"/>
+      </w:pPr>
+      <w:r>
+        <w:rPr>
+          <w:rFonts w:ascii="Arial" w:eastAsia="Arial" w:hAnsi="Arial" w:cs="Arial"/>
+          <w:color w:val="555555"/>
+        </w:rPr>
+        <w:t>Built custom scripts to process Google Form submissions, auto-populate enrollment records in Google Sheets, and trigger email notifications upon enrollment confirmation and billing updates.</w:t>
+      </w:r>
+    </w:p>
+    <w:p>
+      <w:pPr>
+        <w:pStyle w:val="ListParagraph"/>
+        <w:numPr>
+          <w:ilvl w:val="0"/>
+          <w:numId w:val="2"/>
+        </w:numPr>
+        <w:spacing w:before="40" w:after="40"/>
+      </w:pPr>
+      <w:r>
+        <w:rPr>
+          <w:rFonts w:ascii="Arial" w:eastAsia="Arial" w:hAnsi="Arial" w:cs="Arial"/>
+          <w:color w:val="555555"/>
+        </w:rPr>
+        <w:t>Designed automated billing workflows that compute tuition fees, apply discount rules, and generate printable billing statements—eliminating manual data entry and reducing processing errors.</w:t>
+      </w:r>
+    </w:p>
+    <w:p>
+      <w:pPr>
+        <w:pStyle w:val="ListParagraph"/>
+        <w:numPr>
+          <w:ilvl w:val="0"/>
+          <w:numId w:val="2"/>
+        </w:numPr>
+        <w:spacing w:before="40" w:after="40"/>
+      </w:pPr>
+      <w:r>
+        <w:rPr>
+          <w:rFonts w:ascii="Arial" w:eastAsia="Arial" w:hAnsi="Arial" w:cs="Arial"/>
+          <w:color w:val="555555"/>
+        </w:rPr>
+        <w:t>Integrated Google Drive for organized document storage (receipts, enrollment forms) with structured folder management via script automation.</w:t>
+      </w:r>
+    </w:p>
+    <w:p>
+      <w:pPr>
+        <w:pStyle w:val="ListParagraph"/>
+        <w:spacing w:before="40" w:after="40"/>
+        <w:ind w:left="480"/>
+      </w:pPr>
+    </w:p>
+    <w:p>
+      <w:pPr>
+        <w:pBdr>
+          <w:bottom w:val="single" w:sz="8" w:space="1" w:color="2E7D32"/>
+        </w:pBdr>
+        <w:spacing w:before="180" w:after="80"/>
+      </w:pPr>
+      <w:r>
+        <w:rPr>
+          <w:rFonts w:ascii="Arial" w:eastAsia="Arial" w:hAnsi="Arial" w:cs="Arial"/>
+          <w:b/>
+          <w:bCs/>
+          <w:color w:val="1B3A6B"/>
+          <w:spacing w:val="60"/>
+          <w:sz w:val="22"/>
+          <w:szCs w:val="22"/>
+        </w:rPr>
         <w:t>EDUCATION</w:t>
       </w:r>
     </w:p>
@@ -1604,7 +1824,7 @@
         <w:tabs>
           <w:tab w:val="right" w:pos="10080"/>
         </w:tabs>
-        <w:spacing w:before="160" w:after="40"/>
+        <w:spacing w:after="40"/>
       </w:pPr>
       <w:r>
         <w:rPr>
@@ -1615,14 +1835,34 @@
           <w:sz w:val="22"/>
           <w:szCs w:val="22"/>
         </w:rPr>
-        <w:t>B.S. in Software Development</w:t>
+        <w:t xml:space="preserve">B.S. in Software </w:t>
+      </w:r>
+      <w:proofErr w:type="gramStart"/>
+      <w:r>
+        <w:rPr>
+          <w:rFonts w:ascii="Arial" w:eastAsia="Arial" w:hAnsi="Arial" w:cs="Arial"/>
+          <w:b/>
+          <w:bCs/>
+          <w:color w:val="1B3A6B"/>
+          <w:sz w:val="22"/>
+          <w:szCs w:val="22"/>
+        </w:rPr>
+        <w:t>Development</w:t>
       </w:r>
       <w:r>
         <w:rPr>
           <w:rFonts w:ascii="Arial" w:eastAsia="Arial" w:hAnsi="Arial" w:cs="Arial"/>
           <w:color w:val="888888"/>
         </w:rPr>
-        <w:t xml:space="preserve">  |  </w:t>
+        <w:t xml:space="preserve">  |</w:t>
+      </w:r>
+      <w:proofErr w:type="gramEnd"/>
+      <w:r>
+        <w:rPr>
+          <w:rFonts w:ascii="Arial" w:eastAsia="Arial" w:hAnsi="Arial" w:cs="Arial"/>
+          <w:color w:val="888888"/>
+        </w:rPr>
+        <w:t xml:space="preserve">  </w:t>
       </w:r>
       <w:r>
         <w:rPr>
@@ -1636,6 +1876,14 @@
       <w:r>
         <w:tab/>
       </w:r>
+    </w:p>
+    <w:p>
+      <w:pPr>
+        <w:tabs>
+          <w:tab w:val="right" w:pos="10080"/>
+        </w:tabs>
+        <w:spacing w:after="40"/>
+      </w:pPr>
       <w:r>
         <w:rPr>
           <w:rFonts w:ascii="Arial" w:eastAsia="Arial" w:hAnsi="Arial" w:cs="Arial"/>
@@ -1681,14 +1929,34 @@
           <w:sz w:val="22"/>
           <w:szCs w:val="22"/>
         </w:rPr>
-        <w:t>Associate in Computer Technology</w:t>
+        <w:t xml:space="preserve">Associate in Computer </w:t>
+      </w:r>
+      <w:proofErr w:type="gramStart"/>
+      <w:r>
+        <w:rPr>
+          <w:rFonts w:ascii="Arial" w:eastAsia="Arial" w:hAnsi="Arial" w:cs="Arial"/>
+          <w:b/>
+          <w:bCs/>
+          <w:color w:val="1B3A6B"/>
+          <w:sz w:val="22"/>
+          <w:szCs w:val="22"/>
+        </w:rPr>
+        <w:t>Technology</w:t>
       </w:r>
       <w:r>
         <w:rPr>
           <w:rFonts w:ascii="Arial" w:eastAsia="Arial" w:hAnsi="Arial" w:cs="Arial"/>
           <w:color w:val="888888"/>
         </w:rPr>
-        <w:t xml:space="preserve">  |  </w:t>
+        <w:t xml:space="preserve">  |</w:t>
+      </w:r>
+      <w:proofErr w:type="gramEnd"/>
+      <w:r>
+        <w:rPr>
+          <w:rFonts w:ascii="Arial" w:eastAsia="Arial" w:hAnsi="Arial" w:cs="Arial"/>
+          <w:color w:val="888888"/>
+        </w:rPr>
+        <w:t xml:space="preserve">  </w:t>
       </w:r>
       <w:r>
         <w:rPr>
@@ -1733,10 +2001,19 @@
     </w:p>
     <w:p>
       <w:pPr>
+        <w:pStyle w:val="ListParagraph"/>
+        <w:spacing w:before="40" w:after="40"/>
+        <w:ind w:left="480"/>
+      </w:pPr>
+    </w:p>
+    <w:p>
+      <w:pPr>
         <w:pBdr>
           <w:bottom w:val="single" w:sz="8" w:space="1" w:color="2E7D32"/>
         </w:pBdr>
         <w:spacing w:before="180" w:after="80"/>
+      </w:pPr>
+      <w:r>
         <w:rPr>
           <w:rFonts w:ascii="Arial" w:eastAsia="Arial" w:hAnsi="Arial" w:cs="Arial"/>
           <w:b/>
@@ -1746,26 +2023,6 @@
           <w:sz w:val="22"/>
           <w:szCs w:val="22"/>
         </w:rPr>
-      </w:pPr>
-    </w:p>
-    <w:p>
-      <w:pPr>
-        <w:pBdr>
-          <w:bottom w:val="single" w:sz="8" w:space="1" w:color="2E7D32"/>
-        </w:pBdr>
-        <w:spacing w:before="180" w:after="80"/>
-      </w:pPr>
-      <w:r>
-        <w:rPr>
-          <w:rFonts w:ascii="Arial" w:eastAsia="Arial" w:hAnsi="Arial" w:cs="Arial"/>
-          <w:b/>
-          <w:bCs/>
-          <w:color w:val="1B3A6B"/>
-          <w:spacing w:val="60"/>
-          <w:sz w:val="22"/>
-          <w:szCs w:val="22"/>
-        </w:rPr>
-        <w:lastRenderedPageBreak/>
         <w:t>CERTIFICATIONS &amp; PROFESSIONAL DEVELOPMENT</w:t>
       </w:r>
     </w:p>
@@ -1807,7 +2064,7 @@
           <w:rFonts w:ascii="Arial" w:eastAsia="Arial" w:hAnsi="Arial" w:cs="Arial"/>
           <w:color w:val="555555"/>
         </w:rPr>
-        <w:t xml:space="preserve">Computer Systems Servicing NCII </w:t>
+        <w:t>Computer Systems Servicing NCII</w:t>
       </w:r>
     </w:p>
     <w:p>
@@ -2017,10 +2274,69 @@
     </w:lvl>
   </w:abstractNum>
   <w:abstractNum w:abstractNumId="1" w15:restartNumberingAfterBreak="0">
-    <w:nsid w:val="43C636CC"/>
+    <w:nsid w:val="71146768"/>
     <w:multiLevelType w:val="hybridMultilevel"/>
-    <w:tmpl w:val="D2884BC4"/>
-    <w:lvl w:ilvl="0" w:tplc="F8DCC4D8">
+    <w:tmpl w:val="A45261A8"/>
+    <w:lvl w:ilvl="0" w:tplc="C43A9754">
+      <w:start w:val="1"/>
+      <w:numFmt w:val="bullet"/>
+      <w:lvlText w:val="▸"/>
+      <w:lvlJc w:val="left"/>
+      <w:pPr>
+        <w:ind w:left="480" w:hanging="300"/>
+      </w:pPr>
+      <w:rPr>
+        <w:color w:val="2E7D32"/>
+        <w:sz w:val="18"/>
+        <w:szCs w:val="18"/>
+      </w:rPr>
+    </w:lvl>
+    <w:lvl w:ilvl="1" w:tplc="0554A638">
+      <w:numFmt w:val="decimal"/>
+      <w:lvlText w:val=""/>
+      <w:lvlJc w:val="left"/>
+    </w:lvl>
+    <w:lvl w:ilvl="2" w:tplc="506E0192">
+      <w:numFmt w:val="decimal"/>
+      <w:lvlText w:val=""/>
+      <w:lvlJc w:val="left"/>
+    </w:lvl>
+    <w:lvl w:ilvl="3" w:tplc="89586622">
+      <w:numFmt w:val="decimal"/>
+      <w:lvlText w:val=""/>
+      <w:lvlJc w:val="left"/>
+    </w:lvl>
+    <w:lvl w:ilvl="4" w:tplc="9A6EDCBC">
+      <w:numFmt w:val="decimal"/>
+      <w:lvlText w:val=""/>
+      <w:lvlJc w:val="left"/>
+    </w:lvl>
+    <w:lvl w:ilvl="5" w:tplc="C2C6E244">
+      <w:numFmt w:val="decimal"/>
+      <w:lvlText w:val=""/>
+      <w:lvlJc w:val="left"/>
+    </w:lvl>
+    <w:lvl w:ilvl="6" w:tplc="ED84A62E">
+      <w:numFmt w:val="decimal"/>
+      <w:lvlText w:val=""/>
+      <w:lvlJc w:val="left"/>
+    </w:lvl>
+    <w:lvl w:ilvl="7" w:tplc="DF346140">
+      <w:numFmt w:val="decimal"/>
+      <w:lvlText w:val=""/>
+      <w:lvlJc w:val="left"/>
+    </w:lvl>
+    <w:lvl w:ilvl="8" w:tplc="4656BBBC">
+      <w:numFmt w:val="decimal"/>
+      <w:lvlText w:val=""/>
+      <w:lvlJc w:val="left"/>
+    </w:lvl>
+  </w:abstractNum>
+  <w:abstractNum w:abstractNumId="2" w15:restartNumberingAfterBreak="0">
+    <w:nsid w:val="7860541A"/>
+    <w:multiLevelType w:val="hybridMultilevel"/>
+    <w:tmpl w:val="62A83132"/>
+    <w:lvl w:ilvl="0" w:tplc="A3486C2E">
       <w:start w:val="1"/>
       <w:numFmt w:val="bullet"/>
       <w:lvlText w:val="●"/>
@@ -2029,7 +2345,7 @@
         <w:ind w:left="720" w:hanging="360"/>
       </w:pPr>
     </w:lvl>
-    <w:lvl w:ilvl="1" w:tplc="1B4212F2">
+    <w:lvl w:ilvl="1" w:tplc="7878F6D4">
       <w:start w:val="1"/>
       <w:numFmt w:val="bullet"/>
       <w:lvlText w:val="○"/>
@@ -2038,7 +2354,7 @@
         <w:ind w:left="1440" w:hanging="360"/>
       </w:pPr>
     </w:lvl>
-    <w:lvl w:ilvl="2" w:tplc="3C86323A">
+    <w:lvl w:ilvl="2" w:tplc="E01C0B7E">
       <w:start w:val="1"/>
       <w:numFmt w:val="bullet"/>
       <w:lvlText w:val="■"/>
@@ -2047,7 +2363,7 @@
         <w:ind w:left="2160" w:hanging="360"/>
       </w:pPr>
     </w:lvl>
-    <w:lvl w:ilvl="3" w:tplc="40D6ADBE">
+    <w:lvl w:ilvl="3" w:tplc="20B07D48">
       <w:start w:val="1"/>
       <w:numFmt w:val="bullet"/>
       <w:lvlText w:val="●"/>
@@ -2056,7 +2372,7 @@
         <w:ind w:left="2880" w:hanging="360"/>
       </w:pPr>
     </w:lvl>
-    <w:lvl w:ilvl="4" w:tplc="D1FC484E">
+    <w:lvl w:ilvl="4" w:tplc="9BE40FA2">
       <w:start w:val="1"/>
       <w:numFmt w:val="bullet"/>
       <w:lvlText w:val="○"/>
@@ -2065,7 +2381,7 @@
         <w:ind w:left="3600" w:hanging="360"/>
       </w:pPr>
     </w:lvl>
-    <w:lvl w:ilvl="5" w:tplc="634E0E52">
+    <w:lvl w:ilvl="5" w:tplc="18F23B74">
       <w:start w:val="1"/>
       <w:numFmt w:val="bullet"/>
       <w:lvlText w:val="■"/>
@@ -2074,7 +2390,7 @@
         <w:ind w:left="4320" w:hanging="360"/>
       </w:pPr>
     </w:lvl>
-    <w:lvl w:ilvl="6" w:tplc="E49A6432">
+    <w:lvl w:ilvl="6" w:tplc="5BDCA334">
       <w:start w:val="1"/>
       <w:numFmt w:val="bullet"/>
       <w:lvlText w:val="●"/>
@@ -2083,7 +2399,7 @@
         <w:ind w:left="5040" w:hanging="360"/>
       </w:pPr>
     </w:lvl>
-    <w:lvl w:ilvl="7" w:tplc="7248AE9C">
+    <w:lvl w:ilvl="7" w:tplc="760C4420">
       <w:start w:val="1"/>
       <w:numFmt w:val="bullet"/>
       <w:lvlText w:val="●"/>
@@ -2092,7 +2408,7 @@
         <w:ind w:left="5760" w:hanging="360"/>
       </w:pPr>
     </w:lvl>
-    <w:lvl w:ilvl="8" w:tplc="0B96DCFC">
+    <w:lvl w:ilvl="8" w:tplc="CBF8A2C6">
       <w:start w:val="1"/>
       <w:numFmt w:val="bullet"/>
       <w:lvlText w:val="●"/>
@@ -2102,13 +2418,19 @@
       </w:pPr>
     </w:lvl>
   </w:abstractNum>
-  <w:num w:numId="1" w16cid:durableId="646131718">
+  <w:num w:numId="1" w16cid:durableId="140973603">
+    <w:abstractNumId w:val="2"/>
+    <w:lvlOverride w:ilvl="0">
+      <w:startOverride w:val="1"/>
+    </w:lvlOverride>
+  </w:num>
+  <w:num w:numId="2" w16cid:durableId="1673099579">
     <w:abstractNumId w:val="1"/>
     <w:lvlOverride w:ilvl="0">
       <w:startOverride w:val="1"/>
     </w:lvlOverride>
   </w:num>
-  <w:num w:numId="2" w16cid:durableId="1803578713">
+  <w:num w:numId="3" w16cid:durableId="1803578713">
     <w:abstractNumId w:val="0"/>
     <w:lvlOverride w:ilvl="0">
       <w:startOverride w:val="1"/>

</xml_diff>